<commit_message>
Transform to Polyglot Heaven: Home page, reach calculator, language discovery matrix, flashcards, language families & Duolingo comparison
</commit_message>
<xml_diff>
--- a/batch 1 changes.docx
+++ b/batch 1 changes.docx
@@ -8,12 +8,6 @@
           <w:lang w:val="en-US"/>
         </w:rPr>
       </w:pPr>
-      <w:r>
-        <w:rPr>
-          <w:lang w:val="en-US"/>
-        </w:rPr>
-        <w:t>A formality toggle to find which stories fit what the person is looking for. Some are very colloquial and spoken style.</w:t>
-      </w:r>
     </w:p>
     <w:p>
       <w:pPr>
@@ -25,7 +19,13 @@
         <w:rPr>
           <w:lang w:val="en-US"/>
         </w:rPr>
-        <w:t xml:space="preserve">Later: add writing and speaking </w:t>
+        <w:t xml:space="preserve">Basic AI estimate of CEFR level in each </w:t>
+      </w:r>
+      <w:r>
+        <w:rPr>
+          <w:lang w:val="en-US"/>
+        </w:rPr>
+        <w:t>of the four main skills</w:t>
       </w:r>
     </w:p>
     <w:p>
@@ -38,7 +38,7 @@
         <w:rPr>
           <w:lang w:val="en-US"/>
         </w:rPr>
-        <w:t>Basic AI estimate of CEFR level in each skill</w:t>
+        <w:t>AI guide</w:t>
       </w:r>
     </w:p>
     <w:p>
@@ -51,7 +51,35 @@
         <w:rPr>
           <w:lang w:val="en-US"/>
         </w:rPr>
-        <w:t>AI guide</w:t>
+        <w:t xml:space="preserve">We need different categories: </w:t>
+      </w:r>
+      <w:proofErr w:type="spellStart"/>
+      <w:r>
+        <w:rPr>
+          <w:lang w:val="en-US"/>
+        </w:rPr>
+        <w:t>microcuentos</w:t>
+      </w:r>
+      <w:proofErr w:type="spellEnd"/>
+      <w:r>
+        <w:rPr>
+          <w:lang w:val="en-US"/>
+        </w:rPr>
+        <w:t>, educativo, notici</w:t>
+      </w:r>
+      <w:proofErr w:type="spellStart"/>
+      <w:r>
+        <w:rPr>
+          <w:lang w:val="en-US"/>
+        </w:rPr>
+        <w:t>as</w:t>
+      </w:r>
+      <w:proofErr w:type="spellEnd"/>
+      <w:r>
+        <w:rPr>
+          <w:lang w:val="en-US"/>
+        </w:rPr>
+        <w:t xml:space="preserve">, </w:t>
       </w:r>
     </w:p>
     <w:p>
@@ -60,24 +88,10 @@
           <w:lang w:val="en-US"/>
         </w:rPr>
       </w:pPr>
-      <w:r>
-        <w:rPr>
-          <w:lang w:val="en-US"/>
-        </w:rPr>
-        <w:t xml:space="preserve">Mascot: sepia/cuttlefish </w:t>
-      </w:r>
     </w:p>
     <w:p>
-      <w:pPr>
-        <w:rPr>
-          <w:lang w:val="en-US"/>
-        </w:rPr>
-      </w:pPr>
-      <w:r>
-        <w:rPr>
-          <w:lang w:val="en-US"/>
-        </w:rPr>
-        <w:t>¿Use sepia color?</w:t>
+      <w:r>
+        <w:t>Narrador en los cuentos</w:t>
       </w:r>
     </w:p>
     <w:p>
@@ -93,300 +107,224 @@
           <w:lang w:val="en-US"/>
         </w:rPr>
       </w:pPr>
+      <w:r>
+        <w:rPr>
+          <w:lang w:val="en-US"/>
+        </w:rPr>
+        <w:t xml:space="preserve">We’ll need to redo all the cuentos hasta </w:t>
+      </w:r>
+      <w:proofErr w:type="spellStart"/>
+      <w:r>
+        <w:rPr>
+          <w:lang w:val="en-US"/>
+        </w:rPr>
+        <w:t>ahora</w:t>
+      </w:r>
+      <w:proofErr w:type="spellEnd"/>
+      <w:r>
+        <w:rPr>
+          <w:lang w:val="en-US"/>
+        </w:rPr>
+        <w:t>, because about a third of them are off.</w:t>
+      </w:r>
     </w:p>
     <w:p>
-      <w:pPr>
-        <w:rPr>
-          <w:lang w:val="en-US"/>
-        </w:rPr>
-      </w:pPr>
-      <w:r>
-        <w:rPr>
-          <w:lang w:val="en-US"/>
-        </w:rPr>
-        <w:t xml:space="preserve">I’d like </w:t>
-      </w:r>
-      <w:r>
-        <w:rPr>
-          <w:lang w:val="en-US"/>
-        </w:rPr>
-        <w:t>the green</w:t>
-      </w:r>
-      <w:r>
-        <w:rPr>
-          <w:lang w:val="en-US"/>
-        </w:rPr>
+      <w:r>
+        <w:t>Visitas guiadas por sitios turísticos e interesantes</w:t>
+      </w:r>
+      <w:r>
         <w:t xml:space="preserve"> </w:t>
-      </w:r>
-      <w:r>
-        <w:rPr>
-          <w:lang w:val="en-US"/>
-        </w:rPr>
-        <w:t>“</w:t>
-      </w:r>
-      <w:proofErr w:type="spellStart"/>
-      <w:r>
-        <w:rPr>
-          <w:lang w:val="en-US"/>
-        </w:rPr>
-        <w:t>vocabulario</w:t>
-      </w:r>
-      <w:proofErr w:type="spellEnd"/>
-      <w:r>
-        <w:rPr>
-          <w:lang w:val="en-US"/>
-        </w:rPr>
-        <w:t>”</w:t>
-      </w:r>
-      <w:r>
-        <w:rPr>
-          <w:lang w:val="en-US"/>
-        </w:rPr>
-        <w:t xml:space="preserve"> tags</w:t>
-      </w:r>
-      <w:r>
-        <w:rPr>
-          <w:lang w:val="en-US"/>
-        </w:rPr>
-        <w:t xml:space="preserve"> </w:t>
-      </w:r>
-      <w:r>
-        <w:rPr>
-          <w:lang w:val="en-US"/>
-        </w:rPr>
-        <w:t xml:space="preserve">with each cuento </w:t>
-      </w:r>
-      <w:r>
-        <w:rPr>
-          <w:lang w:val="en-US"/>
-        </w:rPr>
-        <w:t xml:space="preserve">to be clickable and sort the cuentos based on </w:t>
-      </w:r>
-      <w:r>
-        <w:rPr>
-          <w:lang w:val="en-US"/>
-        </w:rPr>
-        <w:t xml:space="preserve">similar things </w:t>
-      </w:r>
-      <w:r>
-        <w:rPr>
-          <w:lang w:val="en-US"/>
-        </w:rPr>
-        <w:t>like “</w:t>
-      </w:r>
-      <w:proofErr w:type="spellStart"/>
-      <w:r>
-        <w:rPr>
-          <w:lang w:val="en-US"/>
-        </w:rPr>
-        <w:t>c</w:t>
-      </w:r>
-      <w:r>
-        <w:rPr>
-          <w:lang w:val="en-US"/>
-        </w:rPr>
-        <w:t>ompras</w:t>
-      </w:r>
-      <w:proofErr w:type="spellEnd"/>
-      <w:r>
-        <w:rPr>
-          <w:lang w:val="en-US"/>
-        </w:rPr>
-        <w:t>”, “</w:t>
-      </w:r>
-      <w:proofErr w:type="spellStart"/>
-      <w:r>
-        <w:rPr>
-          <w:lang w:val="en-US"/>
-        </w:rPr>
-        <w:t>t</w:t>
-      </w:r>
-      <w:r>
-        <w:rPr>
-          <w:lang w:val="en-US"/>
-        </w:rPr>
-        <w:t>ransporte</w:t>
-      </w:r>
-      <w:proofErr w:type="spellEnd"/>
-      <w:r>
-        <w:rPr>
-          <w:lang w:val="en-US"/>
-        </w:rPr>
-        <w:t>”, “</w:t>
-      </w:r>
-      <w:proofErr w:type="spellStart"/>
-      <w:r>
-        <w:rPr>
-          <w:lang w:val="en-US"/>
-        </w:rPr>
-        <w:t>cafetería</w:t>
-      </w:r>
-      <w:proofErr w:type="spellEnd"/>
-      <w:r>
-        <w:rPr>
-          <w:lang w:val="en-US"/>
-        </w:rPr>
-        <w:t>”</w:t>
-      </w:r>
-      <w:r>
-        <w:rPr>
-          <w:lang w:val="en-US"/>
-        </w:rPr>
-        <w:t>.</w:t>
       </w:r>
     </w:p>
     <w:p>
-      <w:pPr>
-        <w:rPr>
-          <w:lang w:val="en-US"/>
-        </w:rPr>
-      </w:pPr>
-      <w:r>
-        <w:rPr>
-          <w:lang w:val="en-US"/>
-        </w:rPr>
-        <w:t>Light mode is showing as dark mode.</w:t>
+      <w:r>
+        <w:t>Crear un mapa con distintas regiones</w:t>
       </w:r>
     </w:p>
     <w:p>
       <w:pPr>
-        <w:rPr>
-          <w:lang w:val="en-US"/>
-        </w:rPr>
-      </w:pPr>
-      <w:r>
-        <w:rPr>
-          <w:lang w:val="en-US"/>
-        </w:rPr>
-        <w:t>Let’s add a “</w:t>
-      </w:r>
-      <w:r>
-        <w:rPr>
-          <w:lang w:val="en-US"/>
-        </w:rPr>
-        <w:t xml:space="preserve">world </w:t>
-      </w:r>
-      <w:r>
-        <w:rPr>
-          <w:lang w:val="en-US"/>
-        </w:rPr>
-        <w:t>tour</w:t>
-      </w:r>
-      <w:r>
-        <w:rPr>
-          <w:lang w:val="en-US"/>
-        </w:rPr>
-        <w:t>”</w:t>
-      </w:r>
-      <w:r>
-        <w:rPr>
-          <w:lang w:val="en-US"/>
+        <w:spacing w:after="240" w:line="240" w:lineRule="auto"/>
+        <w:rPr>
+          <w:rFonts w:ascii="Times New Roman" w:eastAsia="Times New Roman" w:hAnsi="Times New Roman" w:cs="Times New Roman"/>
+          <w:kern w:val="0"/>
+          <w:lang w:val="en-US" w:eastAsia="es-MX"/>
+          <w14:ligatures w14:val="none"/>
+        </w:rPr>
+      </w:pPr>
+      <w:r>
+        <w:rPr>
+          <w:rFonts w:ascii="Times New Roman" w:eastAsia="Times New Roman" w:hAnsi="Times New Roman" w:cs="Times New Roman"/>
+          <w:kern w:val="0"/>
+          <w:lang w:val="en-US" w:eastAsia="es-MX"/>
+          <w14:ligatures w14:val="none"/>
+        </w:rPr>
+        <w:t>When adding a new cuen</w:t>
+      </w:r>
+      <w:r>
+        <w:rPr>
+          <w:rFonts w:ascii="Times New Roman" w:eastAsia="Times New Roman" w:hAnsi="Times New Roman" w:cs="Times New Roman"/>
+          <w:kern w:val="0"/>
+          <w:lang w:val="en-US" w:eastAsia="es-MX"/>
+          <w14:ligatures w14:val="none"/>
+        </w:rPr>
+        <w:t xml:space="preserve">to or </w:t>
+      </w:r>
+      <w:proofErr w:type="spellStart"/>
+      <w:r>
+        <w:rPr>
+          <w:rFonts w:ascii="Times New Roman" w:eastAsia="Times New Roman" w:hAnsi="Times New Roman" w:cs="Times New Roman"/>
+          <w:kern w:val="0"/>
+          <w:lang w:val="en-US" w:eastAsia="es-MX"/>
+          <w14:ligatures w14:val="none"/>
+        </w:rPr>
+        <w:t>contentido</w:t>
+      </w:r>
+      <w:proofErr w:type="spellEnd"/>
+      <w:r>
+        <w:rPr>
+          <w:rFonts w:ascii="Times New Roman" w:eastAsia="Times New Roman" w:hAnsi="Times New Roman" w:cs="Times New Roman"/>
+          <w:kern w:val="0"/>
+          <w:lang w:val="en-US" w:eastAsia="es-MX"/>
+          <w14:ligatures w14:val="none"/>
+        </w:rPr>
+        <w:t xml:space="preserve">, I’d like a </w:t>
+      </w:r>
+      <w:r>
+        <w:rPr>
+          <w:rFonts w:ascii="Times New Roman" w:eastAsia="Times New Roman" w:hAnsi="Times New Roman" w:cs="Times New Roman"/>
+          <w:kern w:val="0"/>
+          <w:lang w:val="en-US" w:eastAsia="es-MX"/>
+          <w14:ligatures w14:val="none"/>
+        </w:rPr>
+        <w:t xml:space="preserve">cuento de </w:t>
+      </w:r>
+      <w:proofErr w:type="spellStart"/>
+      <w:r>
+        <w:rPr>
+          <w:rFonts w:ascii="Times New Roman" w:eastAsia="Times New Roman" w:hAnsi="Times New Roman" w:cs="Times New Roman"/>
+          <w:kern w:val="0"/>
+          <w:lang w:val="en-US" w:eastAsia="es-MX"/>
+          <w14:ligatures w14:val="none"/>
+        </w:rPr>
+        <w:t>prueba</w:t>
+      </w:r>
+      <w:proofErr w:type="spellEnd"/>
+      <w:r>
+        <w:rPr>
+          <w:rFonts w:ascii="Times New Roman" w:eastAsia="Times New Roman" w:hAnsi="Times New Roman" w:cs="Times New Roman"/>
+          <w:kern w:val="0"/>
+          <w:lang w:val="en-US" w:eastAsia="es-MX"/>
+          <w14:ligatures w14:val="none"/>
         </w:rPr>
         <w:t xml:space="preserve"> </w:t>
       </w:r>
       <w:r>
         <w:rPr>
-          <w:lang w:val="en-US"/>
-        </w:rPr>
-        <w:t xml:space="preserve">feature </w:t>
-      </w:r>
-      <w:r>
-        <w:rPr>
-          <w:lang w:val="en-US"/>
-        </w:rPr>
-        <w:t>showing a world map</w:t>
-      </w:r>
-      <w:r>
-        <w:rPr>
-          <w:lang w:val="en-US"/>
+          <w:rFonts w:ascii="Times New Roman" w:eastAsia="Times New Roman" w:hAnsi="Times New Roman" w:cs="Times New Roman"/>
+          <w:kern w:val="0"/>
+          <w:lang w:val="en-US" w:eastAsia="es-MX"/>
+          <w14:ligatures w14:val="none"/>
+        </w:rPr>
+        <w:t>in one language (Spain Spanish for now</w:t>
+      </w:r>
+      <w:proofErr w:type="gramStart"/>
+      <w:r>
+        <w:rPr>
+          <w:rFonts w:ascii="Times New Roman" w:eastAsia="Times New Roman" w:hAnsi="Times New Roman" w:cs="Times New Roman"/>
+          <w:kern w:val="0"/>
+          <w:lang w:val="en-US" w:eastAsia="es-MX"/>
+          <w14:ligatures w14:val="none"/>
+        </w:rPr>
+        <w:t>)</w:t>
+      </w:r>
+      <w:proofErr w:type="gramEnd"/>
+      <w:r>
+        <w:rPr>
+          <w:rFonts w:ascii="Times New Roman" w:eastAsia="Times New Roman" w:hAnsi="Times New Roman" w:cs="Times New Roman"/>
+          <w:kern w:val="0"/>
+          <w:lang w:val="en-US" w:eastAsia="es-MX"/>
+          <w14:ligatures w14:val="none"/>
         </w:rPr>
         <w:t xml:space="preserve"> </w:t>
       </w:r>
       <w:r>
         <w:rPr>
-          <w:lang w:val="en-US"/>
-        </w:rPr>
-        <w:t xml:space="preserve">that has </w:t>
-      </w:r>
-      <w:r>
-        <w:rPr>
-          <w:lang w:val="en-US"/>
-        </w:rPr>
-        <w:t>different characters with different names and</w:t>
-      </w:r>
-      <w:r>
-        <w:rPr>
-          <w:lang w:val="en-US"/>
-        </w:rPr>
-        <w:t xml:space="preserve"> short stories</w:t>
-      </w:r>
-      <w:r>
-        <w:rPr>
-          <w:lang w:val="en-US"/>
-        </w:rPr>
-        <w:t>.</w:t>
-      </w:r>
-      <w:r>
-        <w:rPr>
-          <w:lang w:val="en-US"/>
-        </w:rPr>
-        <w:t xml:space="preserve"> Hugo and crew are set in Latin America</w:t>
-      </w:r>
-      <w:r>
-        <w:rPr>
-          <w:lang w:val="en-US"/>
-        </w:rPr>
-        <w:t>, so that’ll be the first stop</w:t>
-      </w:r>
-      <w:r>
-        <w:rPr>
-          <w:lang w:val="en-US"/>
-        </w:rPr>
-        <w:t xml:space="preserve">. </w:t>
-      </w:r>
-      <w:r>
-        <w:rPr>
-          <w:lang w:val="en-US"/>
-        </w:rPr>
-        <w:t xml:space="preserve">We’ll add more </w:t>
-      </w:r>
-      <w:r>
-        <w:rPr>
-          <w:lang w:val="en-US"/>
-        </w:rPr>
-        <w:t xml:space="preserve">stops </w:t>
-      </w:r>
-      <w:r>
-        <w:rPr>
-          <w:lang w:val="en-US"/>
-        </w:rPr>
-        <w:t>later.</w:t>
+          <w:rFonts w:ascii="Times New Roman" w:eastAsia="Times New Roman" w:hAnsi="Times New Roman" w:cs="Times New Roman"/>
+          <w:kern w:val="0"/>
+          <w:lang w:val="en-US" w:eastAsia="es-MX"/>
+          <w14:ligatures w14:val="none"/>
+        </w:rPr>
+        <w:t xml:space="preserve">so we </w:t>
+      </w:r>
+      <w:r>
+        <w:rPr>
+          <w:rFonts w:ascii="Times New Roman" w:eastAsia="Times New Roman" w:hAnsi="Times New Roman" w:cs="Times New Roman"/>
+          <w:kern w:val="0"/>
+          <w:lang w:val="en-US" w:eastAsia="es-MX"/>
+          <w14:ligatures w14:val="none"/>
+        </w:rPr>
+        <w:t xml:space="preserve">make sure it’s good before expanding to all the languages. From there I’d like the ability to </w:t>
+      </w:r>
+      <w:proofErr w:type="spellStart"/>
+      <w:r>
+        <w:rPr>
+          <w:rFonts w:ascii="Times New Roman" w:eastAsia="Times New Roman" w:hAnsi="Times New Roman" w:cs="Times New Roman"/>
+          <w:kern w:val="0"/>
+          <w:lang w:val="en-US" w:eastAsia="es-MX"/>
+          <w14:ligatures w14:val="none"/>
+        </w:rPr>
+        <w:t>e</w:t>
+      </w:r>
+      <w:r>
+        <w:rPr>
+          <w:rFonts w:ascii="Times New Roman" w:eastAsia="Times New Roman" w:hAnsi="Times New Roman" w:cs="Times New Roman"/>
+          <w:kern w:val="0"/>
+          <w:lang w:val="en-US" w:eastAsia="es-MX"/>
+          <w14:ligatures w14:val="none"/>
+        </w:rPr>
+        <w:t>xpandir</w:t>
+      </w:r>
+      <w:proofErr w:type="spellEnd"/>
+      <w:r>
+        <w:rPr>
+          <w:rFonts w:ascii="Times New Roman" w:eastAsia="Times New Roman" w:hAnsi="Times New Roman" w:cs="Times New Roman"/>
+          <w:kern w:val="0"/>
+          <w:lang w:val="en-US" w:eastAsia="es-MX"/>
+          <w14:ligatures w14:val="none"/>
+        </w:rPr>
+        <w:t xml:space="preserve"> a </w:t>
+      </w:r>
+      <w:proofErr w:type="spellStart"/>
+      <w:r>
+        <w:rPr>
+          <w:rFonts w:ascii="Times New Roman" w:eastAsia="Times New Roman" w:hAnsi="Times New Roman" w:cs="Times New Roman"/>
+          <w:kern w:val="0"/>
+          <w:lang w:val="en-US" w:eastAsia="es-MX"/>
+          <w14:ligatures w14:val="none"/>
+        </w:rPr>
+        <w:t>más</w:t>
+      </w:r>
+      <w:proofErr w:type="spellEnd"/>
+      <w:r>
+        <w:rPr>
+          <w:rFonts w:ascii="Times New Roman" w:eastAsia="Times New Roman" w:hAnsi="Times New Roman" w:cs="Times New Roman"/>
+          <w:kern w:val="0"/>
+          <w:lang w:val="en-US" w:eastAsia="es-MX"/>
+          <w14:ligatures w14:val="none"/>
+        </w:rPr>
+        <w:t xml:space="preserve"> lenguas.</w:t>
       </w:r>
     </w:p>
     <w:p>
       <w:pPr>
-        <w:rPr>
-          <w:lang w:val="en-US"/>
-        </w:rPr>
-      </w:pPr>
-      <w:r>
-        <w:rPr>
-          <w:lang w:val="en-US"/>
-        </w:rPr>
-        <w:t xml:space="preserve">Dark mode: impossible to read when hovering over </w:t>
-      </w:r>
-      <w:r>
-        <w:rPr>
-          <w:lang w:val="en-US"/>
-        </w:rPr>
-        <w:t xml:space="preserve">a </w:t>
-      </w:r>
-      <w:r>
-        <w:rPr>
-          <w:lang w:val="en-US"/>
-        </w:rPr>
-        <w:t>language.</w:t>
-      </w:r>
+        <w:spacing w:after="0" w:line="240" w:lineRule="auto"/>
+        <w:rPr>
+          <w:rFonts w:ascii="Times New Roman" w:eastAsia="Times New Roman" w:hAnsi="Times New Roman" w:cs="Times New Roman"/>
+          <w:kern w:val="0"/>
+          <w:lang w:val="en-US" w:eastAsia="es-MX"/>
+          <w14:ligatures w14:val="none"/>
+        </w:rPr>
+      </w:pPr>
     </w:p>
     <w:p>
       <w:pPr>
@@ -394,18 +332,6 @@
           <w:lang w:val="en-US"/>
         </w:rPr>
       </w:pPr>
-      <w:r>
-        <w:rPr>
-          <w:lang w:val="en-US"/>
-        </w:rPr>
-        <w:t xml:space="preserve">Canadian French is </w:t>
-      </w:r>
-      <w:r>
-        <w:rPr>
-          <w:lang w:val="en-US"/>
-        </w:rPr>
-        <w:t>not on the main list. But it is on my settings page.</w:t>
-      </w:r>
     </w:p>
     <w:p>
       <w:pPr>
@@ -413,520 +339,6 @@
           <w:lang w:val="en-US"/>
         </w:rPr>
       </w:pPr>
-      <w:r>
-        <w:rPr>
-          <w:lang w:val="en-US"/>
-        </w:rPr>
-        <w:t>I’d like the Navajo flag rather than the US flag for that language.</w:t>
-      </w:r>
-    </w:p>
-    <w:p>
-      <w:proofErr w:type="spellStart"/>
-      <w:r>
-        <w:t>We</w:t>
-      </w:r>
-      <w:proofErr w:type="spellEnd"/>
-      <w:r>
-        <w:t xml:space="preserve"> </w:t>
-      </w:r>
-      <w:proofErr w:type="spellStart"/>
-      <w:r>
-        <w:t>have</w:t>
-      </w:r>
-      <w:proofErr w:type="spellEnd"/>
-      <w:r>
-        <w:t xml:space="preserve"> </w:t>
-      </w:r>
-      <w:r>
-        <w:t>“</w:t>
-      </w:r>
-      <w:r>
-        <w:t>Inglés y sus variantes</w:t>
-      </w:r>
-      <w:r>
-        <w:t>”</w:t>
-      </w:r>
-      <w:r>
-        <w:t xml:space="preserve"> </w:t>
-      </w:r>
-      <w:r>
-        <w:t>and</w:t>
-      </w:r>
-      <w:r>
-        <w:t xml:space="preserve"> </w:t>
-      </w:r>
-      <w:r>
-        <w:t>“</w:t>
-      </w:r>
-      <w:r>
-        <w:t>Español y sus variantes</w:t>
-      </w:r>
-      <w:r>
-        <w:t>”</w:t>
-      </w:r>
-      <w:r>
-        <w:t xml:space="preserve">, </w:t>
-      </w:r>
-      <w:proofErr w:type="spellStart"/>
-      <w:r>
-        <w:t>but</w:t>
-      </w:r>
-      <w:proofErr w:type="spellEnd"/>
-      <w:r>
-        <w:t xml:space="preserve"> </w:t>
-      </w:r>
-      <w:proofErr w:type="spellStart"/>
-      <w:r>
-        <w:t>not</w:t>
-      </w:r>
-      <w:proofErr w:type="spellEnd"/>
-      <w:r>
-        <w:t xml:space="preserve"> </w:t>
-      </w:r>
-      <w:r>
-        <w:t>“</w:t>
-      </w:r>
-      <w:r>
-        <w:t>Francés y sus variantes</w:t>
-      </w:r>
-      <w:r>
-        <w:t>”</w:t>
-      </w:r>
-      <w:r>
-        <w:t xml:space="preserve">, </w:t>
-      </w:r>
-      <w:r>
-        <w:t>“</w:t>
-      </w:r>
-      <w:r>
-        <w:t>Árabe y sus variantes</w:t>
-      </w:r>
-      <w:r>
-        <w:t>”</w:t>
-      </w:r>
-      <w:r>
-        <w:t xml:space="preserve">, </w:t>
-      </w:r>
-      <w:proofErr w:type="spellStart"/>
-      <w:r>
-        <w:t>or</w:t>
-      </w:r>
-      <w:proofErr w:type="spellEnd"/>
-      <w:r>
-        <w:t xml:space="preserve"> “</w:t>
-      </w:r>
-      <w:r>
-        <w:t>Chino y sus variantes</w:t>
-      </w:r>
-      <w:r>
-        <w:t>”</w:t>
-      </w:r>
-      <w:r>
-        <w:t xml:space="preserve">. </w:t>
-      </w:r>
-    </w:p>
-    <w:p>
-      <w:pPr>
-        <w:rPr>
-          <w:lang w:val="en-US"/>
-        </w:rPr>
-      </w:pPr>
-      <w:r>
-        <w:rPr>
-          <w:lang w:val="en-US"/>
-        </w:rPr>
-        <w:t>In the Spanish</w:t>
-      </w:r>
-      <w:r>
-        <w:rPr>
-          <w:lang w:val="en-US"/>
-        </w:rPr>
-        <w:t xml:space="preserve"> UI</w:t>
-      </w:r>
-      <w:r>
-        <w:rPr>
-          <w:lang w:val="en-US"/>
-        </w:rPr>
-        <w:t>, I’d like se</w:t>
-      </w:r>
-      <w:r>
-        <w:rPr>
-          <w:lang w:val="en-US"/>
-        </w:rPr>
-        <w:t>ntence case not title case.</w:t>
-      </w:r>
-    </w:p>
-    <w:p>
-      <w:pPr>
-        <w:rPr>
-          <w:lang w:val="en-US"/>
-        </w:rPr>
-      </w:pPr>
-      <w:r>
-        <w:rPr>
-          <w:lang w:val="en-US"/>
-        </w:rPr>
-        <w:t>Inglés (</w:t>
-      </w:r>
-      <w:proofErr w:type="spellStart"/>
-      <w:r>
-        <w:rPr>
-          <w:lang w:val="en-US"/>
-        </w:rPr>
-        <w:t>Escocia</w:t>
-      </w:r>
-      <w:proofErr w:type="spellEnd"/>
-      <w:r>
-        <w:rPr>
-          <w:lang w:val="en-US"/>
-        </w:rPr>
-        <w:t>) is showing in Spanish.</w:t>
-      </w:r>
-    </w:p>
-    <w:p>
-      <w:pPr>
-        <w:rPr>
-          <w:lang w:val="en-US"/>
-        </w:rPr>
-      </w:pPr>
-      <w:r>
-        <w:rPr>
-          <w:lang w:val="en-US"/>
-        </w:rPr>
-        <w:t>Add English (US Southern).</w:t>
-      </w:r>
-    </w:p>
-    <w:p>
-      <w:pPr>
-        <w:rPr>
-          <w:lang w:val="en-US"/>
-        </w:rPr>
-      </w:pPr>
-      <w:r>
-        <w:rPr>
-          <w:lang w:val="en-US"/>
-        </w:rPr>
-        <w:t>It currently shows Google TTS. I miss it when it would tell me what model it was (Chirp, Neural, etc.)</w:t>
-      </w:r>
-      <w:r>
-        <w:rPr>
-          <w:lang w:val="en-US"/>
-        </w:rPr>
-        <w:t xml:space="preserve">. That way I can easily know which models </w:t>
-      </w:r>
-      <w:proofErr w:type="gramStart"/>
-      <w:r>
-        <w:rPr>
-          <w:lang w:val="en-US"/>
-        </w:rPr>
-        <w:t>are the lower quality ones</w:t>
-      </w:r>
-      <w:proofErr w:type="gramEnd"/>
-      <w:r>
-        <w:rPr>
-          <w:lang w:val="en-US"/>
-        </w:rPr>
-        <w:t xml:space="preserve"> to find better </w:t>
-      </w:r>
-      <w:r>
-        <w:rPr>
-          <w:lang w:val="en-US"/>
-        </w:rPr>
-        <w:t>voices</w:t>
-      </w:r>
-      <w:r>
-        <w:rPr>
-          <w:lang w:val="en-US"/>
-        </w:rPr>
-        <w:t xml:space="preserve"> on Eleven Labs, etc.</w:t>
-      </w:r>
-      <w:r>
-        <w:rPr>
-          <w:lang w:val="en-US"/>
-        </w:rPr>
-        <w:t xml:space="preserve"> </w:t>
-      </w:r>
-    </w:p>
-    <w:p>
-      <w:pPr>
-        <w:rPr>
-          <w:lang w:val="en-US"/>
-        </w:rPr>
-      </w:pPr>
-      <w:r>
-        <w:rPr>
-          <w:lang w:val="en-US"/>
-        </w:rPr>
-        <w:t>I’d like to be able to flag languages with voices that don’t match the locale so I can find better voices elsewhere.</w:t>
-      </w:r>
-    </w:p>
-    <w:p>
-      <w:pPr>
-        <w:rPr>
-          <w:lang w:val="en-US"/>
-        </w:rPr>
-      </w:pPr>
-      <w:r>
-        <w:rPr>
-          <w:lang w:val="en-US"/>
-        </w:rPr>
-        <w:t>Some of the IPA pronunciations are getting cut off part way through.</w:t>
-      </w:r>
-    </w:p>
-    <w:p>
-      <w:pPr>
-        <w:rPr>
-          <w:lang w:val="en-US"/>
-        </w:rPr>
-      </w:pPr>
-      <w:r>
-        <w:rPr>
-          <w:lang w:val="en-US"/>
-        </w:rPr>
-        <w:lastRenderedPageBreak/>
-        <w:t>Navajo is using the English-speaking model. It’s ok if you put “No model available” with the button grayed out for languages without a Google TTS model.</w:t>
-      </w:r>
-    </w:p>
-    <w:p>
-      <w:pPr>
-        <w:rPr>
-          <w:lang w:val="en-US"/>
-        </w:rPr>
-      </w:pPr>
-      <w:r>
-        <w:rPr>
-          <w:lang w:val="en-US"/>
-        </w:rPr>
-        <w:t>Bring your own Google API key is a cool idea</w:t>
-      </w:r>
-      <w:r>
-        <w:rPr>
-          <w:lang w:val="en-US"/>
-        </w:rPr>
-        <w:t xml:space="preserve">. We need a link to the page where they can get </w:t>
-      </w:r>
-      <w:r>
-        <w:rPr>
-          <w:lang w:val="en-US"/>
-        </w:rPr>
-        <w:t xml:space="preserve">the </w:t>
-      </w:r>
-      <w:r>
-        <w:rPr>
-          <w:lang w:val="en-US"/>
-        </w:rPr>
-        <w:t xml:space="preserve">free </w:t>
-      </w:r>
-      <w:r>
-        <w:rPr>
-          <w:lang w:val="en-US"/>
-        </w:rPr>
-        <w:t>API key</w:t>
-      </w:r>
-      <w:r>
-        <w:rPr>
-          <w:lang w:val="en-US"/>
-        </w:rPr>
-        <w:t xml:space="preserve"> easily, and maybe some basic instructions</w:t>
-      </w:r>
-      <w:r>
-        <w:rPr>
-          <w:lang w:val="en-US"/>
-        </w:rPr>
-        <w:t>.</w:t>
-      </w:r>
-      <w:r>
-        <w:rPr>
-          <w:lang w:val="en-US"/>
-        </w:rPr>
-        <w:t xml:space="preserve"> If they plug in the API key, they get extra features like AI definitions, AI translations in the languages they’re using, etc.</w:t>
-      </w:r>
-    </w:p>
-    <w:p>
-      <w:pPr>
-        <w:rPr>
-          <w:lang w:val="en-US"/>
-        </w:rPr>
-      </w:pPr>
-      <w:r>
-        <w:rPr>
-          <w:lang w:val="en-US"/>
-        </w:rPr>
-        <w:t>I need a “</w:t>
-      </w:r>
-      <w:proofErr w:type="spellStart"/>
-      <w:r>
-        <w:rPr>
-          <w:lang w:val="en-US"/>
-        </w:rPr>
-        <w:t>Delesect</w:t>
-      </w:r>
-      <w:proofErr w:type="spellEnd"/>
-      <w:r>
-        <w:rPr>
-          <w:lang w:val="en-US"/>
-        </w:rPr>
-        <w:t xml:space="preserve"> all” button on the languages page.</w:t>
-      </w:r>
-    </w:p>
-    <w:p>
-      <w:pPr>
-        <w:rPr>
-          <w:lang w:val="en-US"/>
-        </w:rPr>
-      </w:pPr>
-      <w:r>
-        <w:rPr>
-          <w:lang w:val="en-US"/>
-        </w:rPr>
-        <w:t xml:space="preserve">I would like it if the </w:t>
-      </w:r>
-      <w:proofErr w:type="spellStart"/>
-      <w:r>
-        <w:rPr>
-          <w:lang w:val="en-US"/>
-        </w:rPr>
-        <w:t>Rastreador</w:t>
-      </w:r>
-      <w:proofErr w:type="spellEnd"/>
-      <w:r>
-        <w:rPr>
-          <w:lang w:val="en-US"/>
-        </w:rPr>
-        <w:t xml:space="preserve"> de </w:t>
-      </w:r>
-      <w:proofErr w:type="spellStart"/>
-      <w:r>
-        <w:rPr>
-          <w:lang w:val="en-US"/>
-        </w:rPr>
-        <w:t>vocabulario</w:t>
-      </w:r>
-      <w:proofErr w:type="spellEnd"/>
-      <w:r>
-        <w:rPr>
-          <w:lang w:val="en-US"/>
-        </w:rPr>
-        <w:t xml:space="preserve"> would </w:t>
-      </w:r>
-      <w:r>
-        <w:rPr>
-          <w:lang w:val="en-US"/>
-        </w:rPr>
-        <w:t>automatically add words that were seen</w:t>
-      </w:r>
-      <w:r>
-        <w:rPr>
-          <w:lang w:val="en-US"/>
-        </w:rPr>
-        <w:t xml:space="preserve"> on cuentos where I click “</w:t>
-      </w:r>
-      <w:proofErr w:type="spellStart"/>
-      <w:r>
-        <w:rPr>
-          <w:lang w:val="en-US"/>
-        </w:rPr>
-        <w:t>Siguiente</w:t>
-      </w:r>
-      <w:proofErr w:type="spellEnd"/>
-      <w:r>
-        <w:rPr>
-          <w:lang w:val="en-US"/>
-        </w:rPr>
-        <w:t xml:space="preserve"> cuento”</w:t>
-      </w:r>
-      <w:r>
-        <w:rPr>
-          <w:lang w:val="en-US"/>
-        </w:rPr>
-        <w:t>. Add sections for “Seen 1–10 times” and “Seen 10+ times!”</w:t>
-      </w:r>
-      <w:r>
-        <w:rPr>
-          <w:lang w:val="en-US"/>
-        </w:rPr>
-        <w:t xml:space="preserve"> Also, the words weren’t showing up.</w:t>
-      </w:r>
-    </w:p>
-    <w:p>
-      <w:pPr>
-        <w:rPr>
-          <w:lang w:val="en-US"/>
-        </w:rPr>
-      </w:pPr>
-      <w:r>
-        <w:rPr>
-          <w:lang w:val="en-US"/>
-        </w:rPr>
-        <w:t xml:space="preserve">I’d like persistent memory </w:t>
-      </w:r>
-      <w:proofErr w:type="gramStart"/>
-      <w:r>
-        <w:rPr>
-          <w:lang w:val="en-US"/>
-        </w:rPr>
-        <w:t>between</w:t>
-      </w:r>
-      <w:proofErr w:type="gramEnd"/>
-      <w:r>
-        <w:rPr>
-          <w:lang w:val="en-US"/>
-        </w:rPr>
-        <w:t xml:space="preserve"> so my saved changes stay saved between versions.</w:t>
-      </w:r>
-    </w:p>
-    <w:p>
-      <w:pPr>
-        <w:rPr>
-          <w:lang w:val="en-US"/>
-        </w:rPr>
-      </w:pPr>
-      <w:r>
-        <w:rPr>
-          <w:lang w:val="en-US"/>
-        </w:rPr>
-        <w:t>The settings need to include username. For now, use just a circle with their initials as a basic logo.</w:t>
-      </w:r>
-    </w:p>
-    <w:p>
-      <w:pPr>
-        <w:rPr>
-          <w:lang w:val="en-US"/>
-        </w:rPr>
-      </w:pPr>
-      <w:r>
-        <w:rPr>
-          <w:lang w:val="en-US"/>
-        </w:rPr>
-        <w:t>Users should be able to earn achievements and milestones. 100 different words seen total. 1,000 words. 10,000 words. 100,000 words, 1,000,000 words. Learning ___ languages. Tried ___ languages. Tried ___ dialects. Using ___ languages this month. Using ___ dialects this month.</w:t>
-      </w:r>
-    </w:p>
-    <w:p>
-      <w:pPr>
-        <w:rPr>
-          <w:lang w:val="en-US"/>
-        </w:rPr>
-      </w:pPr>
-      <w:r>
-        <w:rPr>
-          <w:lang w:val="en-US"/>
-        </w:rPr>
-        <w:t xml:space="preserve">The UI isn’t </w:t>
-      </w:r>
-      <w:proofErr w:type="gramStart"/>
-      <w:r>
-        <w:rPr>
-          <w:lang w:val="en-US"/>
-        </w:rPr>
-        <w:t>actually translated</w:t>
-      </w:r>
-      <w:proofErr w:type="gramEnd"/>
-      <w:r>
-        <w:rPr>
-          <w:lang w:val="en-US"/>
-        </w:rPr>
-        <w:t xml:space="preserve"> into multiple languages. Let’s do the four that you have on there for now.</w:t>
-      </w:r>
     </w:p>
     <w:sectPr>
       <w:pgSz w:w="12240" w:h="15840"/>
@@ -936,6 +348,127 @@
     </w:sectPr>
   </w:body>
 </w:document>
+</file>
+
+<file path=word/numbering.xml><?xml version="1.0" encoding="utf-8"?>
+<w:numbering xmlns:wpc="http://schemas.microsoft.com/office/word/2010/wordprocessingCanvas" xmlns:cx="http://schemas.microsoft.com/office/drawing/2014/chartex" xmlns:cx1="http://schemas.microsoft.com/office/drawing/2015/9/8/chartex" xmlns:cx2="http://schemas.microsoft.com/office/drawing/2015/10/21/chartex" xmlns:cx3="http://schemas.microsoft.com/office/drawing/2016/5/9/chartex" xmlns:cx4="http://schemas.microsoft.com/office/drawing/2016/5/10/chartex" xmlns:cx5="http://schemas.microsoft.com/office/drawing/2016/5/11/chartex" xmlns:cx6="http://schemas.microsoft.com/office/drawing/2016/5/12/chartex" xmlns:cx7="http://schemas.microsoft.com/office/drawing/2016/5/13/chartex" xmlns:cx8="http://schemas.microsoft.com/office/drawing/2016/5/14/chartex" xmlns:mc="http://schemas.openxmlformats.org/markup-compatibility/2006" xmlns:m="http://schemas.openxmlformats.org/officeDocument/2006/math" xmlns:aink="http://schemas.microsoft.com/office/drawing/2016/ink" xmlns:am3d="http://schemas.microsoft.com/office/drawing/2017/model3d" xmlns:oel="http://schemas.microsoft.com/office/2019/extlst" xmlns:r="http://schemas.openxmlformats.org/officeDocument/2006/relationships" xmlns:wp14="http://schemas.microsoft.com/office/word/2010/wordprocessingDrawing" xmlns:wp="http://schemas.openxmlformats.org/drawingml/2006/wordprocessingDrawing" xmlns:wpg="http://schemas.microsoft.com/office/word/2010/wordprocessingGroup" xmlns:wpi="http://schemas.microsoft.com/office/word/2010/wordprocessingInk" xmlns:wps="http://schemas.microsoft.com/office/word/2010/wordprocessingShape" xmlns:o="urn:schemas-microsoft-com:office:office" xmlns:v="urn:schemas-microsoft-com:vml" xmlns:w10="urn:schemas-microsoft-com:office:word" xmlns:w="http://schemas.openxmlformats.org/wordprocessingml/2006/main" xmlns:w14="http://schemas.microsoft.com/office/word/2010/wordml" xmlns:w15="http://schemas.microsoft.com/office/word/2012/wordml" xmlns:w16cex="http://schemas.microsoft.com/office/word/2018/wordml/cex" xmlns:w16cid="http://schemas.microsoft.com/office/word/2016/wordml/cid" xmlns:w16="http://schemas.microsoft.com/office/word/2018/wordml" xmlns:w16sdtdh="http://schemas.microsoft.com/office/word/2020/wordml/sdtdatahash" xmlns:w16sdtfl="http://schemas.microsoft.com/office/word/2024/wordml/sdtformatlock" xmlns:w16se="http://schemas.microsoft.com/office/word/2015/wordml/symex" xmlns:w16du="http://schemas.microsoft.com/office/word/2023/wordml/word16du" xmlns:wne="http://schemas.microsoft.com/office/word/2006/wordml" mc:Ignorable="w14 w15 w16se w16cid w16 w16cex w16sdtdh w16sdtfl w16du wp14">
+  <w:abstractNum w:abstractNumId="0" w15:restartNumberingAfterBreak="0">
+    <w:nsid w:val="0C320745"/>
+    <w:multiLevelType w:val="hybridMultilevel"/>
+    <w:tmpl w:val="0CCC5F46"/>
+    <w:lvl w:ilvl="0" w:tplc="080A0001">
+      <w:start w:val="1"/>
+      <w:numFmt w:val="bullet"/>
+      <w:lvlText w:val=""/>
+      <w:lvlJc w:val="left"/>
+      <w:pPr>
+        <w:ind w:left="720" w:hanging="360"/>
+      </w:pPr>
+      <w:rPr>
+        <w:rFonts w:ascii="Symbol" w:hAnsi="Symbol" w:hint="default"/>
+      </w:rPr>
+    </w:lvl>
+    <w:lvl w:ilvl="1" w:tplc="080A0003" w:tentative="1">
+      <w:start w:val="1"/>
+      <w:numFmt w:val="bullet"/>
+      <w:lvlText w:val="o"/>
+      <w:lvlJc w:val="left"/>
+      <w:pPr>
+        <w:ind w:left="1440" w:hanging="360"/>
+      </w:pPr>
+      <w:rPr>
+        <w:rFonts w:ascii="Courier New" w:hAnsi="Courier New" w:cs="Courier New" w:hint="default"/>
+      </w:rPr>
+    </w:lvl>
+    <w:lvl w:ilvl="2" w:tplc="080A0005" w:tentative="1">
+      <w:start w:val="1"/>
+      <w:numFmt w:val="bullet"/>
+      <w:lvlText w:val=""/>
+      <w:lvlJc w:val="left"/>
+      <w:pPr>
+        <w:ind w:left="2160" w:hanging="360"/>
+      </w:pPr>
+      <w:rPr>
+        <w:rFonts w:ascii="Wingdings" w:hAnsi="Wingdings" w:hint="default"/>
+      </w:rPr>
+    </w:lvl>
+    <w:lvl w:ilvl="3" w:tplc="080A0001" w:tentative="1">
+      <w:start w:val="1"/>
+      <w:numFmt w:val="bullet"/>
+      <w:lvlText w:val=""/>
+      <w:lvlJc w:val="left"/>
+      <w:pPr>
+        <w:ind w:left="2880" w:hanging="360"/>
+      </w:pPr>
+      <w:rPr>
+        <w:rFonts w:ascii="Symbol" w:hAnsi="Symbol" w:hint="default"/>
+      </w:rPr>
+    </w:lvl>
+    <w:lvl w:ilvl="4" w:tplc="080A0003" w:tentative="1">
+      <w:start w:val="1"/>
+      <w:numFmt w:val="bullet"/>
+      <w:lvlText w:val="o"/>
+      <w:lvlJc w:val="left"/>
+      <w:pPr>
+        <w:ind w:left="3600" w:hanging="360"/>
+      </w:pPr>
+      <w:rPr>
+        <w:rFonts w:ascii="Courier New" w:hAnsi="Courier New" w:cs="Courier New" w:hint="default"/>
+      </w:rPr>
+    </w:lvl>
+    <w:lvl w:ilvl="5" w:tplc="080A0005" w:tentative="1">
+      <w:start w:val="1"/>
+      <w:numFmt w:val="bullet"/>
+      <w:lvlText w:val=""/>
+      <w:lvlJc w:val="left"/>
+      <w:pPr>
+        <w:ind w:left="4320" w:hanging="360"/>
+      </w:pPr>
+      <w:rPr>
+        <w:rFonts w:ascii="Wingdings" w:hAnsi="Wingdings" w:hint="default"/>
+      </w:rPr>
+    </w:lvl>
+    <w:lvl w:ilvl="6" w:tplc="080A0001" w:tentative="1">
+      <w:start w:val="1"/>
+      <w:numFmt w:val="bullet"/>
+      <w:lvlText w:val=""/>
+      <w:lvlJc w:val="left"/>
+      <w:pPr>
+        <w:ind w:left="5040" w:hanging="360"/>
+      </w:pPr>
+      <w:rPr>
+        <w:rFonts w:ascii="Symbol" w:hAnsi="Symbol" w:hint="default"/>
+      </w:rPr>
+    </w:lvl>
+    <w:lvl w:ilvl="7" w:tplc="080A0003" w:tentative="1">
+      <w:start w:val="1"/>
+      <w:numFmt w:val="bullet"/>
+      <w:lvlText w:val="o"/>
+      <w:lvlJc w:val="left"/>
+      <w:pPr>
+        <w:ind w:left="5760" w:hanging="360"/>
+      </w:pPr>
+      <w:rPr>
+        <w:rFonts w:ascii="Courier New" w:hAnsi="Courier New" w:cs="Courier New" w:hint="default"/>
+      </w:rPr>
+    </w:lvl>
+    <w:lvl w:ilvl="8" w:tplc="080A0005" w:tentative="1">
+      <w:start w:val="1"/>
+      <w:numFmt w:val="bullet"/>
+      <w:lvlText w:val=""/>
+      <w:lvlJc w:val="left"/>
+      <w:pPr>
+        <w:ind w:left="6480" w:hanging="360"/>
+      </w:pPr>
+      <w:rPr>
+        <w:rFonts w:ascii="Wingdings" w:hAnsi="Wingdings" w:hint="default"/>
+      </w:rPr>
+    </w:lvl>
+  </w:abstractNum>
+  <w:num w:numId="1" w16cid:durableId="2100633408">
+    <w:abstractNumId w:val="0"/>
+  </w:num>
+</w:numbering>
 </file>
 
 <file path=word/styles.xml><?xml version="1.0" encoding="utf-8"?>
@@ -1389,7 +922,6 @@
     <w:next w:val="Normal"/>
     <w:link w:val="Ttulo3Car"/>
     <w:uiPriority w:val="9"/>
-    <w:semiHidden/>
     <w:unhideWhenUsed/>
     <w:qFormat/>
     <w:rsid w:val="008B596C"/>
@@ -1541,7 +1073,6 @@
   <w:style w:type="character" w:default="1" w:styleId="Fuentedeprrafopredeter">
     <w:name w:val="Default Paragraph Font"/>
     <w:uiPriority w:val="1"/>
-    <w:semiHidden/>
     <w:unhideWhenUsed/>
   </w:style>
   <w:style w:type="table" w:default="1" w:styleId="Tablanormal">
@@ -1597,7 +1128,6 @@
     <w:basedOn w:val="Fuentedeprrafopredeter"/>
     <w:link w:val="Ttulo3"/>
     <w:uiPriority w:val="9"/>
-    <w:semiHidden/>
     <w:rsid w:val="008B596C"/>
     <w:rPr>
       <w:rFonts w:eastAsiaTheme="majorEastAsia" w:cstheme="majorBidi"/>
@@ -1853,6 +1383,23 @@
       <w:smallCaps/>
       <w:color w:val="0F4761" w:themeColor="accent1" w:themeShade="BF"/>
       <w:spacing w:val="5"/>
+    </w:rPr>
+  </w:style>
+  <w:style w:type="paragraph" w:styleId="NormalWeb">
+    <w:name w:val="Normal (Web)"/>
+    <w:basedOn w:val="Normal"/>
+    <w:uiPriority w:val="99"/>
+    <w:semiHidden/>
+    <w:unhideWhenUsed/>
+    <w:rsid w:val="009B7F96"/>
+    <w:pPr>
+      <w:spacing w:before="100" w:beforeAutospacing="1" w:after="100" w:afterAutospacing="1" w:line="240" w:lineRule="auto"/>
+    </w:pPr>
+    <w:rPr>
+      <w:rFonts w:ascii="Times New Roman" w:eastAsia="Times New Roman" w:hAnsi="Times New Roman" w:cs="Times New Roman"/>
+      <w:kern w:val="0"/>
+      <w:lang w:eastAsia="es-MX"/>
+      <w14:ligatures w14:val="none"/>
     </w:rPr>
   </w:style>
 </w:styles>

</xml_diff>

<commit_message>
fix(languages): register Catalan, Galician, Occitan and story languages to prevent disappearing
</commit_message>
<xml_diff>
--- a/batch 1 changes.docx
+++ b/batch 1 changes.docx
@@ -8,7 +8,119 @@
           <w:lang w:val="en-US"/>
         </w:rPr>
       </w:pPr>
+      <w:r>
+        <w:rPr>
+          <w:noProof/>
+          <w:lang w:val="en-US"/>
+        </w:rPr>
+        <w:drawing>
+          <wp:inline distT="0" distB="0" distL="0" distR="0" wp14:anchorId="013B7056" wp14:editId="2B46392C">
+            <wp:extent cx="4165600" cy="635000"/>
+            <wp:effectExtent l="0" t="0" r="0" b="0"/>
+            <wp:docPr id="795875594" name="Imagen 6"/>
+            <wp:cNvGraphicFramePr>
+              <a:graphicFrameLocks xmlns:a="http://schemas.openxmlformats.org/drawingml/2006/main" noChangeAspect="1"/>
+            </wp:cNvGraphicFramePr>
+            <a:graphic xmlns:a="http://schemas.openxmlformats.org/drawingml/2006/main">
+              <a:graphicData uri="http://schemas.openxmlformats.org/drawingml/2006/picture">
+                <pic:pic xmlns:pic="http://schemas.openxmlformats.org/drawingml/2006/picture">
+                  <pic:nvPicPr>
+                    <pic:cNvPr id="795875594" name="Imagen 795875594"/>
+                    <pic:cNvPicPr/>
+                  </pic:nvPicPr>
+                  <pic:blipFill>
+                    <a:blip r:embed="rId5">
+                      <a:extLst>
+                        <a:ext uri="{28A0092B-C50C-407E-A947-70E740481C1C}">
+                          <a14:useLocalDpi xmlns:a14="http://schemas.microsoft.com/office/drawing/2010/main" val="0"/>
+                        </a:ext>
+                      </a:extLst>
+                    </a:blip>
+                    <a:stretch>
+                      <a:fillRect/>
+                    </a:stretch>
+                  </pic:blipFill>
+                  <pic:spPr>
+                    <a:xfrm>
+                      <a:off x="0" y="0"/>
+                      <a:ext cx="4165600" cy="635000"/>
+                    </a:xfrm>
+                    <a:prstGeom prst="rect">
+                      <a:avLst/>
+                    </a:prstGeom>
+                  </pic:spPr>
+                </pic:pic>
+              </a:graphicData>
+            </a:graphic>
+          </wp:inline>
+        </w:drawing>
+      </w:r>
     </w:p>
+    <w:p>
+      <w:proofErr w:type="spellStart"/>
+      <w:r>
+        <w:t>Let’s</w:t>
+      </w:r>
+      <w:proofErr w:type="spellEnd"/>
+      <w:r>
+        <w:t xml:space="preserve"> </w:t>
+      </w:r>
+      <w:proofErr w:type="spellStart"/>
+      <w:r>
+        <w:t>separate</w:t>
+      </w:r>
+      <w:proofErr w:type="spellEnd"/>
+      <w:r>
+        <w:t xml:space="preserve"> </w:t>
+      </w:r>
+      <w:proofErr w:type="spellStart"/>
+      <w:r>
+        <w:t>these</w:t>
+      </w:r>
+      <w:proofErr w:type="spellEnd"/>
+      <w:r>
+        <w:t xml:space="preserve"> </w:t>
+      </w:r>
+      <w:proofErr w:type="spellStart"/>
+      <w:r>
+        <w:t>out</w:t>
+      </w:r>
+      <w:proofErr w:type="spellEnd"/>
+      <w:r>
+        <w:t xml:space="preserve">: </w:t>
+      </w:r>
+      <w:r>
+        <w:t>noruego y danés, noruego y sueco</w:t>
+      </w:r>
+    </w:p>
+    <w:p>
+      <w:proofErr w:type="spellStart"/>
+      <w:r>
+        <w:t>Let’s</w:t>
+      </w:r>
+      <w:proofErr w:type="spellEnd"/>
+      <w:r>
+        <w:t xml:space="preserve"> </w:t>
+      </w:r>
+      <w:proofErr w:type="spellStart"/>
+      <w:r>
+        <w:t>add</w:t>
+      </w:r>
+      <w:proofErr w:type="spellEnd"/>
+      <w:r>
+        <w:t xml:space="preserve"> español y portug</w:t>
+      </w:r>
+      <w:r>
+        <w:t>ués</w:t>
+      </w:r>
+      <w:r>
+        <w:t xml:space="preserve">, </w:t>
+      </w:r>
+      <w:r>
+        <w:t>español e italiano</w:t>
+      </w:r>
+    </w:p>
+    <w:p/>
     <w:p>
       <w:pPr>
         <w:rPr>

</xml_diff>